<commit_message>
Initial commit: JJNET Sovereign Cybersecurity Multi-Agent Platform
</commit_message>
<xml_diff>
--- a/outputs/PA-20260916-89421.docx
+++ b/outputs/PA-20260916-89421.docx
@@ -457,7 +457,7 @@
           <w:color w:val="0B2239"/>
           <w:sz w:val="18"/>
         </w:rPr>
-        <w:t>Palo Alto 防火牆與 Cortex XDR 於 2026-09-16T22:14:10Z - 2026-09-16T22:16:01Z 期間，偵測到來自外部惡意來源 (185.220.101.5) 針對內部 DMZ 主機 (WS-FIN-088.corp.jjnet.tw) 發動之 Microsoft Windows Task Scheduler Privilege Escalation (觸發次數：14 次連續探測)。攻擊者嘗試利用弱點 CVE-2026-3841 與混淆 PowerShell 腳本突破邊界防護並實施記憶體注入。周邊安全規則「SecRule-Inbound-DMZ-Protect」及時觸發並執行「reset-both」，端點代理已自動完成邏輯網路隔離並保全揮發性記憶體跡證。目前現有事證支持威脅已獲有效圍堵，後續憑證可能於其他主機重用之風險仍列入待確認追蹤項。</w:t>
+        <w:t>Palo Alto 防火牆與 Cortex XDR 於 2026-09-16T22:14:10Z - 2026-09-16T22:16:01Z 期間，偵測到來自外部惡意來源 (185.220.101.5) 針對內部 DMZ 主機 (WS-FIN-088) 發動之 Microsoft Windows Task Scheduler Privilege Escalation (觸發次數：14 次連續探測)。攻擊者嘗試利用弱點 CVE-2026-3841 與混淆 PowerShell 腳本突破邊界防護並實施記憶體注入。周邊安全規則「SecRule-Inbound-DMZ-Protect」及時觸發並執行「reset-both」，端點代理已自動完成邏輯網路隔離並保全揮發性記憶體跡證。目前現有事證支持威脅已獲有效圍堵，後續憑證可能於其他主機重用之風險仍列入待確認追蹤項。</w:t>
       </w:r>
     </w:p>
     <w:tbl>
@@ -888,7 +888,7 @@
                 <w:color w:val="0B2239"/>
                 <w:sz w:val="16"/>
               </w:rPr>
-              <w:t>WS-FIN-088.corp.jjnet.tw</w:t>
+              <w:t>WS-FIN-088</w:t>
             </w:r>
           </w:p>
         </w:tc>
@@ -2292,7 +2292,7 @@
                 <w:color w:val="0B2239"/>
                 <w:sz w:val="16"/>
               </w:rPr>
-              <w:t>維持受感染主機 WS-FIN-088.corp.jjnet.tw 之 EDR 邏輯網路隔離，保全 Volatile Memory Dump 供鑑識</w:t>
+              <w:t>維持受感染主機 WS-FIN-088 之 EDR 邏輯網路隔離，保全 Volatile Memory Dump 供鑑識</w:t>
             </w:r>
           </w:p>
         </w:tc>

</xml_diff>